<commit_message>
Australia VDR: tick Others for Senate inquiry row
Co-Authored-By: Claude Opus 5.5 <noreply@anthropic.com>
Claude-Session: https://claude.ai/code/session_01Kn2WARNo7K7k12QYTPEKnR
</commit_message>
<xml_diff>
--- a/AUSTRALIA_VDR_SEPTEMBER_2026.docx
+++ b/AUSTRALIA_VDR_SEPTEMBER_2026.docx
@@ -3267,17 +3267,13 @@
             </w:pPr>
             <w:r>
               <w:rPr>
-                <w:b/>
-                <w:bCs/>
-                <w:sz w:val="18"/>
-                <w:szCs w:val="18"/>
-              </w:rPr>
-              <w:sym w:font="Wingdings" w:char="F0FE"/>
-            </w:r>
-            <w:r>
-              <w:rPr>
-                <w:b/>
-                <w:bCs/>
+                <w:sz w:val="18"/>
+                <w:szCs w:val="18"/>
+              </w:rPr>
+              <w:sym w:font="Wingdings" w:char="F070"/>
+            </w:r>
+            <w:r>
+              <w:rPr>
                 <w:sz w:val="18"/>
                 <w:szCs w:val="18"/>
               </w:rPr>

</xml_diff>